<commit_message>
docs(pr12): record mutation evidence
</commit_message>
<xml_diff>
--- a/docs/labs/pr12/nb/reports/0302-pz02-nb.docx
+++ b/docs/labs/pr12/nb/reports/0302-pz02-nb.docx
@@ -3037,7 +3037,7 @@
     </w:p>
     <w:p>
       <w:r>
-        <w:t>Разработанные автоматические тесты: verifier/application named assertions plus CLI fixture checks; historical M01-M05 retained and a new versioned r2 M01-M05 series is queued on corrected C3 baseline.</w:t>
+        <w:t>Разработанные автоматические тесты: verifier/application named assertions plus CLI fixture checks; historical M01-M05 retained and a new versioned r2 M01-M05 series was executed on corrected C3 baseline.</w:t>
       </w:r>
     </w:p>
     <w:p>
@@ -3522,17 +3522,8 @@
             <w:shd w:val="clear" w:color="auto" w:fill="F2F2F2"/>
           </w:tcPr>
           <w:p>
-            <w:pPr>
-              <w:pStyle w:val="ae"/>
-              <w:keepNext/>
-              <w:spacing w:before="40" w:after="40"/>
-              <w:jc w:val="left"/>
-            </w:pPr>
-            <w:r>
-              <w:t>Тест /</w:t>
-            </w:r>
-            <w:r>
-              <w:t xml:space="preserve"> набор</w:t>
+            <w:r>
+              <w:t>Test / set</w:t>
             </w:r>
           </w:p>
         </w:tc>
@@ -3542,14 +3533,8 @@
             <w:shd w:val="clear" w:color="auto" w:fill="F2F2F2"/>
           </w:tcPr>
           <w:p>
-            <w:pPr>
-              <w:pStyle w:val="ae"/>
-              <w:keepNext/>
-              <w:spacing w:before="40" w:after="40"/>
-              <w:jc w:val="left"/>
-            </w:pPr>
-            <w:r>
-              <w:t>Версия и условия</w:t>
+            <w:r>
+              <w:t>Version and conditions</w:t>
             </w:r>
           </w:p>
         </w:tc>
@@ -3559,14 +3544,8 @@
             <w:shd w:val="clear" w:color="auto" w:fill="F2F2F2"/>
           </w:tcPr>
           <w:p>
-            <w:pPr>
-              <w:pStyle w:val="ae"/>
-              <w:keepNext/>
-              <w:spacing w:before="40" w:after="40"/>
-              <w:jc w:val="left"/>
-            </w:pPr>
-            <w:r>
-              <w:t>Фактический результат</w:t>
+            <w:r>
+              <w:t>Observed result</w:t>
             </w:r>
           </w:p>
         </w:tc>
@@ -3576,14 +3555,8 @@
             <w:shd w:val="clear" w:color="auto" w:fill="F2F2F2"/>
           </w:tcPr>
           <w:p>
-            <w:pPr>
-              <w:pStyle w:val="ae"/>
-              <w:keepNext/>
-              <w:spacing w:before="40" w:after="40"/>
-              <w:jc w:val="left"/>
-            </w:pPr>
-            <w:r>
-              <w:t>PASS / FAIL / BLOCKED / NOT RUN</w:t>
+            <w:r>
+              <w:t>Status</w:t>
             </w:r>
           </w:p>
         </w:tc>
@@ -3593,14 +3566,8 @@
             <w:shd w:val="clear" w:color="auto" w:fill="F2F2F2"/>
           </w:tcPr>
           <w:p>
-            <w:pPr>
-              <w:pStyle w:val="ae"/>
-              <w:keepNext/>
-              <w:spacing w:before="40" w:after="40"/>
-              <w:jc w:val="left"/>
-            </w:pPr>
-            <w:r>
-              <w:t>Подтверждение</w:t>
+            <w:r>
+              <w:t>Evidence</w:t>
             </w:r>
           </w:p>
         </w:tc>
@@ -3688,7 +3655,7 @@
           </w:tcPr>
           <w:p>
             <w:r>
-              <w:t>current-head native checks queued; prior PASS is historical</w:t>
+              <w:t>current-head native checks PASS before mutation series; post-series gate pending</w:t>
             </w:r>
           </w:p>
         </w:tc>
@@ -3698,7 +3665,7 @@
           </w:tcPr>
           <w:p>
             <w:r>
-              <w:t>QUEUED</w:t>
+              <w:t>PARTIAL</w:t>
             </w:r>
           </w:p>
         </w:tc>
@@ -3708,7 +3675,7 @@
           </w:tcPr>
           <w:p>
             <w:r>
-              <w:t>PR #33; current native CI links in evidence/index.json</w:t>
+              <w:t>PR #33; current and final-gate CI links in evidence/index.json</w:t>
             </w:r>
           </w:p>
         </w:tc>
@@ -3740,7 +3707,7 @@
           </w:tcPr>
           <w:p>
             <w:r>
-              <w:t>content/evidence checks and report build PASS locally; current CI queued</w:t>
+              <w:t>content/evidence checks and report build PASS locally; report delivery job 118168664445 success, other current-head jobs tracked</w:t>
             </w:r>
           </w:p>
         </w:tc>
@@ -3750,7 +3717,7 @@
           </w:tcPr>
           <w:p>
             <w:r>
-              <w:t>QUEUED</w:t>
+              <w:t>PARTIAL</w:t>
             </w:r>
           </w:p>
         </w:tc>
@@ -3760,7 +3727,7 @@
           </w:tcPr>
           <w:p>
             <w:r>
-              <w:t>PR #34; current report CI link in evidence/index.json</w:t>
+              <w:t>PR #34; current report CI links in evidence/index.json</w:t>
             </w:r>
           </w:p>
         </w:tc>
@@ -4164,7 +4131,7 @@
           </w:tcPr>
           <w:p>
             <w:r>
-              <w:t>baseline is the corrected C3 source; current final gate queued</w:t>
+              <w:t>baseline PASS before; post-series final gate pending</w:t>
             </w:r>
           </w:p>
         </w:tc>
@@ -4174,7 +4141,7 @@
           </w:tcPr>
           <w:p>
             <w:r>
-              <w:t>current C3 native CI link; restoration log pending</w:t>
+              <w:t>current C3 native CI and final-gate link</w:t>
             </w:r>
           </w:p>
         </w:tc>
@@ -4210,7 +4177,7 @@
           </w:tcPr>
           <w:p>
             <w:r>
-              <w:t>compile/detection results queued</w:t>
+              <w:t>all five compile; each named suite exit 1</w:t>
             </w:r>
           </w:p>
         </w:tc>
@@ -4220,7 +4187,7 @@
           </w:tcPr>
           <w:p>
             <w:r>
-              <w:t>r2 patch files and five queued native runs</w:t>
+              <w:t>r2 patch/log pairs and five native jobs</w:t>
             </w:r>
           </w:p>
         </w:tc>
@@ -4256,7 +4223,7 @@
           </w:tcPr>
           <w:p>
             <w:r>
-              <w:t>restoration/final gate pending native mutation completion</w:t>
+              <w:t>post-series final gate pending</w:t>
             </w:r>
           </w:p>
         </w:tc>
@@ -4266,7 +4233,7 @@
           </w:tcPr>
           <w:p>
             <w:r>
-              <w:t>final restoration evidence pending</w:t>
+              <w:t>final-gate run 39285847846</w:t>
             </w:r>
           </w:p>
         </w:tc>
@@ -4397,7 +4364,7 @@
           </w:tcPr>
           <w:p>
             <w:r>
-              <w:t>queued</w:t>
+              <w:t>0</w:t>
             </w:r>
           </w:p>
         </w:tc>
@@ -4407,7 +4374,7 @@
           </w:tcPr>
           <w:p>
             <w:r>
-              <w:t>raw-byte/known-vector assertions / expected exit 1</w:t>
+              <w:t>raw-byte/known-vector assertions / exit 1</w:t>
             </w:r>
           </w:p>
         </w:tc>
@@ -4417,7 +4384,7 @@
           </w:tcPr>
           <w:p>
             <w:r>
-              <w:t>pending</w:t>
+              <w:t>detected</w:t>
             </w:r>
           </w:p>
         </w:tc>
@@ -4427,7 +4394,7 @@
           </w:tcPr>
           <w:p>
             <w:r>
-              <w:t>survivor/retest pending</w:t>
+              <w:t>none; no survivor</w:t>
             </w:r>
           </w:p>
         </w:tc>
@@ -4437,7 +4404,7 @@
           </w:tcPr>
           <w:p>
             <w:r>
-              <w:t>r2/M01.log after native run; queued run in evidence/index.json</w:t>
+              <w:t>r2/M01.log; job 118160603037</w:t>
             </w:r>
           </w:p>
         </w:tc>
@@ -4469,7 +4436,7 @@
           </w:tcPr>
           <w:p>
             <w:r>
-              <w:t>queued</w:t>
+              <w:t>0</w:t>
             </w:r>
           </w:p>
         </w:tc>
@@ -4479,7 +4446,7 @@
           </w:tcPr>
           <w:p>
             <w:r>
-              <w:t>altered-body/repeat assertions / expected exit 1</w:t>
+              <w:t>altered-body/repeat assertions / exit 1</w:t>
             </w:r>
           </w:p>
         </w:tc>
@@ -4489,7 +4456,7 @@
           </w:tcPr>
           <w:p>
             <w:r>
-              <w:t>pending</w:t>
+              <w:t>detected</w:t>
             </w:r>
           </w:p>
         </w:tc>
@@ -4499,7 +4466,7 @@
           </w:tcPr>
           <w:p>
             <w:r>
-              <w:t>survivor/retest pending</w:t>
+              <w:t>none; no survivor</w:t>
             </w:r>
           </w:p>
         </w:tc>
@@ -4509,7 +4476,7 @@
           </w:tcPr>
           <w:p>
             <w:r>
-              <w:t>r2/M02.log after native run; queued run in evidence/index.json</w:t>
+              <w:t>r2/M02.log; job 118160720826</w:t>
             </w:r>
           </w:p>
         </w:tc>
@@ -4541,7 +4508,7 @@
           </w:tcPr>
           <w:p>
             <w:r>
-              <w:t>queued</w:t>
+              <w:t>0</w:t>
             </w:r>
           </w:p>
         </w:tc>
@@ -4551,7 +4518,7 @@
           </w:tcPr>
           <w:p>
             <w:r>
-              <w:t>past301 freshness assertion / expected exit 1</w:t>
+              <w:t>past301 freshness assertion / exit 1</w:t>
             </w:r>
           </w:p>
         </w:tc>
@@ -4561,7 +4528,7 @@
           </w:tcPr>
           <w:p>
             <w:r>
-              <w:t>pending</w:t>
+              <w:t>detected</w:t>
             </w:r>
           </w:p>
         </w:tc>
@@ -4571,7 +4538,7 @@
           </w:tcPr>
           <w:p>
             <w:r>
-              <w:t>survivor/retest pending</w:t>
+              <w:t>none; no survivor</w:t>
             </w:r>
           </w:p>
         </w:tc>
@@ -4581,7 +4548,7 @@
           </w:tcPr>
           <w:p>
             <w:r>
-              <w:t>r2/M03.log after native run; queued run in evidence/index.json</w:t>
+              <w:t>r2/M03.log; job 118160734812</w:t>
             </w:r>
           </w:p>
         </w:tc>
@@ -4613,7 +4580,7 @@
           </w:tcPr>
           <w:p>
             <w:r>
-              <w:t>queued</w:t>
+              <w:t>0</w:t>
             </w:r>
           </w:p>
         </w:tc>
@@ -4623,7 +4590,7 @@
           </w:tcPr>
           <w:p>
             <w:r>
-              <w:t>past300/future300 boundary / expected exit 1</w:t>
+              <w:t>past300/future300 boundary / exit 1</w:t>
             </w:r>
           </w:p>
         </w:tc>
@@ -4633,7 +4600,7 @@
           </w:tcPr>
           <w:p>
             <w:r>
-              <w:t>pending</w:t>
+              <w:t>detected</w:t>
             </w:r>
           </w:p>
         </w:tc>
@@ -4643,7 +4610,7 @@
           </w:tcPr>
           <w:p>
             <w:r>
-              <w:t>survivor/retest pending</w:t>
+              <w:t>none; no survivor</w:t>
             </w:r>
           </w:p>
         </w:tc>
@@ -4653,7 +4620,7 @@
           </w:tcPr>
           <w:p>
             <w:r>
-              <w:t>r2/M04.log after native run; queued run in evidence/index.json</w:t>
+              <w:t>r2/M04.log; job 118160751628</w:t>
             </w:r>
           </w:p>
         </w:tc>
@@ -4685,7 +4652,7 @@
           </w:tcPr>
           <w:p>
             <w:r>
-              <w:t>queued</w:t>
+              <w:t>0</w:t>
             </w:r>
           </w:p>
         </w:tc>
@@ -4695,7 +4662,7 @@
           </w:tcPr>
           <w:p>
             <w:r>
-              <w:t>timestamp-conflict assertion / expected exit 1</w:t>
+              <w:t>timestamp-conflict assertion / exit 1</w:t>
             </w:r>
           </w:p>
         </w:tc>
@@ -4705,7 +4672,7 @@
           </w:tcPr>
           <w:p>
             <w:r>
-              <w:t>pending</w:t>
+              <w:t>detected</w:t>
             </w:r>
           </w:p>
         </w:tc>
@@ -4715,7 +4682,7 @@
           </w:tcPr>
           <w:p>
             <w:r>
-              <w:t>survivor/retest pending</w:t>
+              <w:t>none; no survivor</w:t>
             </w:r>
           </w:p>
         </w:tc>
@@ -4725,7 +4692,7 @@
           </w:tcPr>
           <w:p>
             <w:r>
-              <w:t>r2/M05.log after native run; queued run in evidence/index.json</w:t>
+              <w:t>r2/M05.log; job 118160771432</w:t>
             </w:r>
           </w:p>
         </w:tc>
@@ -4734,7 +4701,7 @@
     <w:p>
       <w:pPr/>
       <w:r>
-        <w:t>Итог r2 series на момент сборки отчёта: seeded 5; native compile/detection jobs queued; survivors/retests/final restoration evidence pending. Hidden suite NOT_PROVIDED.</w:t>
+        <w:t>Итог r2 series: seeded 5; compile 5; first named-suite detection 5; survivors 0; retest 0. Final corrected-baseline gate after the series is still pending. Hidden suite NOT_PROVIDED.</w:t>
       </w:r>
     </w:p>
     <w:p>
@@ -4744,7 +4711,7 @@
     </w:p>
     <w:p>
       <w:r>
-        <w:t>Состояние сдачи: corrected candidate source/test baseline d164aebd5b746151da41717f0ffb483eb9b39a63; all temporary mutants are outside the deliverable branches; native CI links are recorded as queued. Immutable tag not created; human review/merge required.</w:t>
+        <w:t>Состояние сдачи: corrected candidate source/test baseline d164aebd5b746151da41717f0ffb483eb9b39a63; all temporary mutants are outside the deliverable branches; five native mutation jobs succeeded at job level. Immutable tag not created; human review/merge required.</w:t>
       </w:r>
     </w:p>
     <w:p>
@@ -4862,7 +4829,7 @@
           </w:tcPr>
           <w:p>
             <w:r>
-              <w:t>Named tests, coverage analysis and five versioned mutation patches are recorded; native mutation compile/detection and restoration jobs are queued.</w:t>
+              <w:t>Named tests, coverage analysis and five versioned mutation patches/logs are recorded; compile 0 and detection 1 are present for each mutant; post-series corrected-baseline gate is pending.</w:t>
             </w:r>
           </w:p>
         </w:tc>
@@ -4943,7 +4910,7 @@
     </w:p>
     <w:p>
       <w:r>
-        <w:t>Что показали покрытие и эксперимент: full module statement coverage 55.8%; domain/application historical profiles 87.7%/83.3%; CLI/adapters unit profile 0%; r2 mutation outcome awaits native jobs.</w:t>
+        <w:t>Что показали покрытие и эксперимент: full module statement coverage 55.8%; domain/application historical profiles 87.7%/83.3%; CLI/adapters unit profile 0%; five current compiling mutants were killed; post-series corrected-baseline gate is pending.</w:t>
       </w:r>
     </w:p>
     <w:p>
@@ -5172,7 +5139,7 @@
           </w:tcPr>
           <w:p>
             <w:r>
-              <w:t>PR #33 current chain; current native checks queued; prior verified checks remain historical; PR #34 report package open</w:t>
+              <w:t>PR #33 current chain; current native checks PASS before mutation series; post-series final gate pending; PR #34 report package open</w:t>
             </w:r>
           </w:p>
         </w:tc>
@@ -5239,7 +5206,7 @@
           </w:tcPr>
           <w:p>
             <w:r>
-              <w:t>historical M01-M05 retained; current r2 M01-M05 patches and queued runs recorded; no mutation PASS or restoration result claimed yet; no mutant merged</w:t>
+              <w:t>historical M01-M05 retained; current r2 M01-M05 all compile and are killed; post-series restoration gate pending; no mutant merged</w:t>
             </w:r>
           </w:p>
         </w:tc>
@@ -5355,7 +5322,7 @@
     </w:p>
     <w:p>
       <w:r>
-        <w:t>Что открыть/выполнить: Открыть https://github.com/hitpipe/hitpipe/actions/runs/39281597831 (C3 head d164aeb; native check queued at build time) для commit d164aebd5b746151da41717f0ffb483eb9b39a63 / tag [human after merge: 0302-pz02-nb-v1 not created]; раскрыть задание temporary PR12 NB mutation r2 harness; native jobs queued. Показать SHA, задание, команду, собственные тесты студента и фактический итог, а не только зелёный список заданий.</w:t>
+        <w:t>Что открыть/выполнить: Открыть https://github.com/hitpipe/hitpipe/actions/runs/39281598031 (C3 head d164aeb; job 118156796184 success) для commit d164aebd5b746151da41717f0ffb483eb9b39a63 / tag [human after merge: 0302-pz02-nb-v1 not created]; раскрыть задание temporary PR12 NB mutation r2 harness; five native jobs succeeded. Показать SHA, задание, команду, собственные тесты студента и фактический итог, а не только зелёный список заданий.</w:t>
       </w:r>
     </w:p>
     <w:p>

</xml_diff>

<commit_message>
docs(pr12): close repeat-review gate
</commit_message>
<xml_diff>
--- a/docs/labs/pr12/nb/reports/0302-pz02-nb.docx
+++ b/docs/labs/pr12/nb/reports/0302-pz02-nb.docx
@@ -3655,7 +3655,7 @@
           </w:tcPr>
           <w:p>
             <w:r>
-              <w:t>current-head native checks PASS before mutation series; post-series gate pending</w:t>
+              <w:t>current-head native checks and post-series corrected-baseline gate PASS</w:t>
             </w:r>
           </w:p>
         </w:tc>
@@ -3665,7 +3665,7 @@
           </w:tcPr>
           <w:p>
             <w:r>
-              <w:t>PARTIAL</w:t>
+              <w:t>PASS</w:t>
             </w:r>
           </w:p>
         </w:tc>
@@ -3675,7 +3675,7 @@
           </w:tcPr>
           <w:p>
             <w:r>
-              <w:t>PR #33; current and final-gate CI links in evidence/index.json</w:t>
+              <w:t>PR #33; final-gate run 39285847846/job 118171472621</w:t>
             </w:r>
           </w:p>
         </w:tc>
@@ -3697,7 +3697,7 @@
           </w:tcPr>
           <w:p>
             <w:r>
-              <w:t>a2eee52 source snapshot; refreshed files in working tree</w:t>
+              <w:t>c42820c report head; refreshed files committed</w:t>
             </w:r>
           </w:p>
         </w:tc>
@@ -3707,7 +3707,7 @@
           </w:tcPr>
           <w:p>
             <w:r>
-              <w:t>content/evidence checks and report build PASS locally; report delivery job 118168664445 success, other current-head jobs tracked</w:t>
+              <w:t>content/evidence checks and report build PASS locally; iam job 118177294111 success, intake job 118177292029 in progress, processing/delivery queued</w:t>
             </w:r>
           </w:p>
         </w:tc>
@@ -3727,7 +3727,7 @@
           </w:tcPr>
           <w:p>
             <w:r>
-              <w:t>PR #34; current report CI links in evidence/index.json</w:t>
+              <w:t>PR #34; report-head CI links in evidence/index.json</w:t>
             </w:r>
           </w:p>
         </w:tc>
@@ -4131,7 +4131,7 @@
           </w:tcPr>
           <w:p>
             <w:r>
-              <w:t>baseline PASS before; post-series final gate pending</w:t>
+              <w:t>baseline PASS before and after mutation series</w:t>
             </w:r>
           </w:p>
         </w:tc>
@@ -4141,7 +4141,7 @@
           </w:tcPr>
           <w:p>
             <w:r>
-              <w:t>current C3 native CI and final-gate link</w:t>
+              <w:t>C3 run 39281598031; final gate 39285847846</w:t>
             </w:r>
           </w:p>
         </w:tc>
@@ -4223,7 +4223,7 @@
           </w:tcPr>
           <w:p>
             <w:r>
-              <w:t>post-series final gate pending</w:t>
+              <w:t>post-series final gate PASS; job 118171472621</w:t>
             </w:r>
           </w:p>
         </w:tc>
@@ -4701,7 +4701,7 @@
     <w:p>
       <w:pPr/>
       <w:r>
-        <w:t>Итог r2 series: seeded 5; compile 5; first named-suite detection 5; survivors 0; retest 0. Final corrected-baseline gate after the series is still pending. Hidden suite NOT_PROVIDED.</w:t>
+        <w:t>Итог r2 series: seeded 5; compile 5; first named-suite detection 5; survivors 0; retest 0. Final corrected-baseline gate after the series PASS: run 39285847846, job 118171472621. Hidden suite NOT_PROVIDED.</w:t>
       </w:r>
     </w:p>
     <w:p>
@@ -4829,7 +4829,7 @@
           </w:tcPr>
           <w:p>
             <w:r>
-              <w:t>Named tests, coverage analysis and five versioned mutation patches/logs are recorded; compile 0 and detection 1 are present for each mutant; post-series corrected-baseline gate is pending.</w:t>
+              <w:t>Named tests, coverage analysis and five versioned mutation patches/logs are recorded; compile 0 and detection 1 are present for each mutant; post-series corrected-baseline gate PASS (39285847846/118171472621).</w:t>
             </w:r>
           </w:p>
         </w:tc>
@@ -4910,7 +4910,7 @@
     </w:p>
     <w:p>
       <w:r>
-        <w:t>Что показали покрытие и эксперимент: full module statement coverage 55.8%; domain/application historical profiles 87.7%/83.3%; CLI/adapters unit profile 0%; five current compiling mutants were killed; post-series corrected-baseline gate is pending.</w:t>
+        <w:t>Что показали покрытие и эксперимент: full module statement coverage 55.8%; domain/application historical profiles 87.7%/83.3%; CLI/adapters unit profile 0%; five current compiling mutants were killed; post-series corrected-baseline gate PASS (39285847846/118171472621).</w:t>
       </w:r>
     </w:p>
     <w:p>
@@ -5139,7 +5139,7 @@
           </w:tcPr>
           <w:p>
             <w:r>
-              <w:t>PR #33 current chain; current native checks PASS before mutation series; post-series final gate pending; PR #34 report package open</w:t>
+              <w:t>PR #33 current chain; current native checks and post-series final gate PASS; PR #34 report package open with current-head CI tracked</w:t>
             </w:r>
           </w:p>
         </w:tc>
@@ -5206,7 +5206,7 @@
           </w:tcPr>
           <w:p>
             <w:r>
-              <w:t>historical M01-M05 retained; current r2 M01-M05 all compile and are killed; post-series restoration gate pending; no mutant merged</w:t>
+              <w:t>historical M01-M05 retained; current r2 M01-M05 all compile and are killed; post-series restoration gate PASS; no mutant merged</w:t>
             </w:r>
           </w:p>
         </w:tc>

</xml_diff>